<commit_message>
feat: full website scrutiny updates, author guidelines alignment, and downloads refresh
</commit_message>
<xml_diff>
--- a/public/downloads/manuscript-template.docx
+++ b/public/downloads/manuscript-template.docx
@@ -224,9 +224,9 @@
     </w:p>
     <w:p>
       <w:r>
-        <w:t>Follow Vancouver / NLM citation style (numbered sequentially in square brackets [1,2]):</w:t>
+        <w:t>Follow Vancouver / NLM citation style (number references consecutively in order of first mention; cite them in the text as superscript Arabic numerals):</w:t>
         <w:br/>
-        <w:t>1. Author AB, Author CD. Title of article. J JMN Med Sci. 2025;1(1):10-15.</w:t>
+        <w:t>1. Author AB, Author CD. Title of article. JMN J Med Sci. 2025 Jul–Dec;1(1):3–10.</w:t>
       </w:r>
     </w:p>
     <w:sectPr>

</xml_diff>